<commit_message>
Finalize Assignment 3 record on main
</commit_message>
<xml_diff>
--- a/agents/innovation_disruption_agent/records/Shuoying_Wang_Assignment_3_Agent_Record.docx
+++ b/agents/innovation_disruption_agent/records/Shuoying_Wang_Assignment_3_Agent_Record.docx
@@ -21,7 +21,7 @@
         <w:jc w:val="center"/>
       </w:pPr>
       <w:r>
-        <w:t>Specialist Agent Record</w:t>
+        <w:t>Assignment 3 Innovation and Disruption Agent Record</w:t>
       </w:r>
     </w:p>
     <w:p>
@@ -29,7 +29,7 @@
         <w:jc w:val="center"/>
       </w:pPr>
       <w:r>
-        <w:t>MASY1-GC 1800 | Assignments 2-8</w:t>
+        <w:t>MASY1-GC 1800 | Shuoying Wang | 12 October 2026</w:t>
       </w:r>
     </w:p>
     <w:tbl>
@@ -57,7 +57,7 @@
               <w:pStyle w:val="Callout"/>
             </w:pPr>
             <w:r>
-              <w:t>Complete this record from the evidence in your working scaffold. Keep it concise. The record documents what you specialized, how you tested it, what failed or changed, and what professional judgment you reached.</w:t>
+              <w:t>The same proposed LLM support process has different business-model implications: conditional High exposure for an hourly-billed outsourcer and conditional Low exposure for an internal manufacturer desk. This record preserves the weak first analysis, the revised agent, and the tests behind that judgment.</w:t>
             </w:r>
           </w:p>
         </w:tc>
@@ -375,7 +375,7 @@
               <w:rPr>
                 <w:sz w:val="17"/>
               </w:rPr>
-              <w:t>assignment-3-innovation-disruption</w:t>
+              <w:t>main; developed on assignment-3-innovation-disruption</w:t>
             </w:r>
           </w:p>
         </w:tc>
@@ -423,7 +423,7 @@
               <w:rPr>
                 <w:sz w:val="17"/>
               </w:rPr>
-              <w:t>19124fc0b445043cff79572847a6dc21909f7b32</w:t>
+              <w:t>b223abe (merge); 68f8fc7 (tested candidate)</w:t>
             </w:r>
           </w:p>
         </w:tc>
@@ -1380,7 +1380,7 @@
               <w:rPr>
                 <w:sz w:val="17"/>
               </w:rPr>
-              <w:t>Course Chapter 5; OECD/Eurostat Oslo Manual 2018; Vaswani et al., Attention Is All You Need (2017); Brynjolfsson, Li, and Raymond, Generative AI at Work (NBER 31161, published 2025). Sources checked October 12, 2026. Organization economics are hypothetical case assumptions.</w:t>
+              <w:t>Course Chapter 5; OECD/Eurostat Oslo Manual 2018; Vaswani et al., Attention Is All You Need (2017); Brynjolfsson, Li, and Raymond, Generative AI at Work, NBER Working Paper 31161 (2023; journal version 2025). Sources checked October 12, 2026. Organization economics are hypothetical case assumptions.</w:t>
             </w:r>
           </w:p>
         </w:tc>
@@ -1668,7 +1668,7 @@
               <w:rPr>
                 <w:sz w:val="17"/>
               </w:rPr>
-              <w:t>The fictional cases cannot validate a real management decision. Abstain from a firm severity or profitable-commercialization claim until contracts, margins, deployment results, and client behavior are verified. Saved tests show context sensitivity but not performance on arbitrary future cases.</w:t>
+              <w:t>Fictional cases do not validate a real decision. Abstain from firm severity or commercialization claims without contracts, margins, pilot results, and client behavior. Saved tests show context sensitivity only.</w:t>
             </w:r>
           </w:p>
         </w:tc>
@@ -1954,7 +1954,7 @@
         <w:color w:val="666666"/>
         <w:sz w:val="16"/>
       </w:rPr>
-      <w:t>Specialist Agent Record</w:t>
+      <w:t>Assignment 3 Innovation and Disruption Agent Record</w:t>
     </w:r>
   </w:p>
 </w:ftr>

</xml_diff>